<commit_message>
Corrige fechas: sesión 2 el 3 de noviembre y feedback el 12
Co-Authored-By: Claude Opus 5.5 <noreply@anthropic.com>
</commit_message>
<xml_diff>
--- a/descargas/Taller-automatismos-Reynasa-completo.docx
+++ b/descargas/Taller-automatismos-Reynasa-completo.docx
@@ -9450,7 +9450,7 @@
           <w:sz w:val="17"/>
           <w:szCs w:val="17"/>
         </w:rPr>
-        <w:t xml:space="preserve">Este panel quedó sin resolver en nuestra sesión. Buen material para la del 12 de noviembre.</w:t>
+        <w:t xml:space="preserve">Este panel quedó sin resolver en nuestra sesión. Buen material para la sesión de feedback del 12 de noviembre.</w:t>
       </w:r>
     </w:p>
     <w:p>
@@ -13755,14 +13755,15 @@
         </w:tblBorders>
       </w:tblPr>
       <w:tblGrid>
-        <w:gridCol w:w="3212"/>
-        <w:gridCol w:w="3212"/>
-        <w:gridCol w:w="3212"/>
+        <w:gridCol w:w="2409"/>
+        <w:gridCol w:w="2409"/>
+        <w:gridCol w:w="2409"/>
+        <w:gridCol w:w="2409"/>
       </w:tblGrid>
       <w:tr>
         <w:tc>
           <w:tcPr>
-            <w:tcW w:type="dxa" w:w="3212"/>
+            <w:tcW w:type="dxa" w:w="2409"/>
             <w:tcBorders>
               <w:top w:val="none" w:color="FFFFFF" w:sz="0"/>
               <w:left w:val="none" w:color="FFFFFF" w:sz="0"/>
@@ -13793,7 +13794,7 @@
         </w:tc>
         <w:tc>
           <w:tcPr>
-            <w:tcW w:type="dxa" w:w="3212"/>
+            <w:tcW w:type="dxa" w:w="2409"/>
             <w:tcBorders>
               <w:top w:val="none" w:color="FFFFFF" w:sz="0"/>
               <w:left w:val="none" w:color="FFFFFF" w:sz="0"/>
@@ -13824,7 +13825,7 @@
         </w:tc>
         <w:tc>
           <w:tcPr>
-            <w:tcW w:type="dxa" w:w="3212"/>
+            <w:tcW w:type="dxa" w:w="2409"/>
             <w:tcBorders>
               <w:top w:val="none" w:color="FFFFFF" w:sz="0"/>
               <w:left w:val="none" w:color="FFFFFF" w:sz="0"/>
@@ -13839,7 +13840,7 @@
                 <w:sz w:val="52"/>
                 <w:szCs w:val="52"/>
               </w:rPr>
-              <w:t xml:space="preserve">12 nov</w:t>
+              <w:t xml:space="preserve">3 nov</w:t>
             </w:r>
           </w:p>
           <w:p>
@@ -13849,7 +13850,38 @@
                 <w:sz w:val="16"/>
                 <w:szCs w:val="16"/>
               </w:rPr>
-              <w:t xml:space="preserve">Segunda sesión: automatismos de defensa y puesta en común del reto</w:t>
+              <w:t xml:space="preserve">Sesión 2: automatismos de defensa</w:t>
+            </w:r>
+          </w:p>
+        </w:tc>
+        <w:tc>
+          <w:tcPr>
+            <w:tcW w:type="dxa" w:w="2409"/>
+            <w:tcBorders>
+              <w:top w:val="none" w:color="FFFFFF" w:sz="0"/>
+              <w:left w:val="none" w:color="FFFFFF" w:sz="0"/>
+              <w:bottom w:val="none" w:color="FFFFFF" w:sz="0"/>
+              <w:right w:val="none" w:color="FFFFFF" w:sz="0"/>
+            </w:tcBorders>
+          </w:tcPr>
+          <w:p>
+            <w:r>
+              <w:rPr>
+                <w:rFonts w:ascii="Georgia" w:cs="Georgia" w:eastAsia="Georgia" w:hAnsi="Georgia"/>
+                <w:sz w:val="52"/>
+                <w:szCs w:val="52"/>
+              </w:rPr>
+              <w:t xml:space="preserve">12 nov</w:t>
+            </w:r>
+          </w:p>
+          <w:p>
+            <w:r>
+              <w:rPr>
+                <w:color w:val="4A5466"/>
+                <w:sz w:val="16"/>
+                <w:szCs w:val="16"/>
+              </w:rPr>
+              <w:t xml:space="preserve">Sesión 3: feedback y puesta en común del reto</w:t>
             </w:r>
           </w:p>
         </w:tc>
@@ -13875,17 +13907,17 @@
         <w:t xml:space="preserve">reto guiado</w:t>
       </w:r>
       <w:r>
-        <w:t xml:space="preserve"> personal (el seguimiento pasa por RR. HH.). No es obligatorio, pero el </w:t>
+        <w:t xml:space="preserve"> personal (el seguimiento pasa por RR. HH.). No es obligatorio. El </w:t>
       </w:r>
       <w:r>
         <w:rPr>
           <w:b/>
           <w:bCs/>
         </w:rPr>
-        <w:t xml:space="preserve">12 de noviembre</w:t>
-      </w:r>
-      <w:r>
-        <w:t xml:space="preserve"> se pone en común cómo ha ido y si ha habido algún cambio. En esa segunda sesión se verán los </w:t>
+        <w:t xml:space="preserve">3 de noviembre</w:t>
+      </w:r>
+      <w:r>
+        <w:t xml:space="preserve"> llega la segunda sesión, sobre los </w:t>
       </w:r>
       <w:r>
         <w:rPr>
@@ -13895,7 +13927,17 @@
         <w:t xml:space="preserve">automatismos de defensa</w:t>
       </w:r>
       <w:r>
-        <w:t xml:space="preserve">, entre ellos la victimización, y habrá un reto nuevo.</w:t>
+        <w:t xml:space="preserve"> (entre ellos la victimización), y el </w:t>
+      </w:r>
+      <w:r>
+        <w:rPr>
+          <w:b/>
+          <w:bCs/>
+        </w:rPr>
+        <w:t xml:space="preserve">12 de noviembre</w:t>
+      </w:r>
+      <w:r>
+        <w:t xml:space="preserve">, en la sesión de feedback, se pone en común cómo ha ido el reto y si ha habido algún cambio.</w:t>
       </w:r>
     </w:p>
     <w:p>
@@ -14491,7 +14533,7 @@
         <w:t xml:space="preserve">«Cuando procesas información»</w:t>
       </w:r>
       <w:r>
-        <w:t xml:space="preserve"> quedó sin resolver. Podría retomarse el 12 de noviembre.</w:t>
+        <w:t xml:space="preserve"> quedó sin resolver. Podría retomarse el 3 o el 12 de noviembre.</w:t>
       </w:r>
     </w:p>
     <w:p>

</xml_diff>

<commit_message>
Añade grupo, sesión y horario (Grupo I, 14/10, 9:00-14:00)
Co-Authored-By: Claude Opus 5.5 <noreply@anthropic.com>
</commit_message>
<xml_diff>
--- a/descargas/Taller-automatismos-Reynasa-completo.docx
+++ b/descargas/Taller-automatismos-Reynasa-completo.docx
@@ -260,7 +260,7 @@
           <w:sz w:val="23"/>
           <w:szCs w:val="23"/>
         </w:rPr>
-        <w:t xml:space="preserve">Taller «Gimnasio cerebral» impartido por María y Rodrigo (Oye · Oportunidades y Estrategias) en Reynasa Recambios, el 14 de octubre de 2026.</w:t>
+        <w:t xml:space="preserve">Taller «Gimnasio cerebral» impartido por María y Rodrigo (Oye · Oportunidades y Estrategias) en Reynasa Recambios. Grupo I · Sesión 1 · Automatismos de eficiencia · miércoles 14 de octubre de 2026, de 9:00 a 14:00.</w:t>
       </w:r>
     </w:p>
     <w:p>
@@ -13788,7 +13788,7 @@
                 <w:sz w:val="16"/>
                 <w:szCs w:val="16"/>
               </w:rPr>
-              <w:t xml:space="preserve">Segundo grupo del taller</w:t>
+              <w:t xml:space="preserve">Grupo II: sesión 1</w:t>
             </w:r>
           </w:p>
         </w:tc>
@@ -13819,7 +13819,7 @@
                 <w:sz w:val="16"/>
                 <w:szCs w:val="16"/>
               </w:rPr>
-              <w:t xml:space="preserve">Tercer grupo del taller</w:t>
+              <w:t xml:space="preserve">Grupo III: sesión 1</w:t>
             </w:r>
           </w:p>
         </w:tc>
@@ -13850,7 +13850,7 @@
                 <w:sz w:val="16"/>
                 <w:szCs w:val="16"/>
               </w:rPr>
-              <w:t xml:space="preserve">Sesión 2: automatismos de defensa</w:t>
+              <w:t xml:space="preserve">Grupo I · Sesión 2: automatismos de defensa (9:00 a 14:00)</w:t>
             </w:r>
           </w:p>
         </w:tc>
@@ -13881,7 +13881,7 @@
                 <w:sz w:val="16"/>
                 <w:szCs w:val="16"/>
               </w:rPr>
-              <w:t xml:space="preserve">Sesión 3: feedback y puesta en común del reto</w:t>
+              <w:t xml:space="preserve">Grupo I · Sesión 3: feedback y puesta en común del reto (9:00 a 11:00)</w:t>
             </w:r>
           </w:p>
         </w:tc>
@@ -14805,7 +14805,7 @@
           <w:sz w:val="17"/>
           <w:szCs w:val="17"/>
         </w:rPr>
-        <w:t xml:space="preserve">Taller «Gimnasio cerebral: automatismos de eficiencia», impartido por María y Rodrigo (Oye · Oportunidades y Estrategias) en Reynasa Recambios el 14 de octubre de 2026. Resumen preparado por Rubén López (Reynasa) a partir de las grabaciones y las fotos de la sesión.</w:t>
+        <w:t xml:space="preserve">Taller «Gimnasio cerebral: automatismos de eficiencia», impartido por María y Rodrigo (Oye · Oportunidades y Estrategias) en Reynasa Recambios. Grupo I (Equipos transversales: Contabilidad, Clientes, Almacén, Compras, Pedidos, Compras urgentes, Informática y Marketing), miércoles 14 de octubre de 2026, de 9:00 a 14:00. Resumen preparado por Rubén López (Reynasa) a partir de las grabaciones y las fotos de la sesión.</w:t>
       </w:r>
     </w:p>
     <w:sectPr>

</xml_diff>